<commit_message>
Expand Moguan knowledge base through Song dynasty
</commit_message>
<xml_diff>
--- a/docs/墨观产品定义框架与愿景.docx
+++ b/docs/墨观产品定义框架与愿景.docx
@@ -57,7 +57,7 @@
           <w:color w:val="5B6573"/>
           <w:sz w:val="20"/>
         </w:rPr>
-        <w:t>基于产品设定 v0.4｜2026 年 7 月 23 日</w:t>
+        <w:t>基于产品设定 v0.5｜2026 年 7 月 23 日</w:t>
       </w:r>
     </w:p>
     <w:p>
@@ -76,7 +76,7 @@
           <w:color w:val="0B2545"/>
           <w:sz w:val="26"/>
         </w:rPr>
-        <w:t>从中国古代星空出发，结合真实天象、地球天气与公共事件，用先秦—两汉的思想体系分析世界如何变化。</w:t>
+        <w:t>从中国古代星空出发，结合真实天象、地球天气与公共事件，用先秦至宋代的分层文献体系分析世界如何变化。</w:t>
       </w:r>
     </w:p>
     <w:p>
@@ -205,7 +205,7 @@
           <w:color w:val="1F2937"/>
           <w:sz w:val="22"/>
         </w:rPr>
-        <w:t>一座可检索、可校勘、可引用的先秦—两汉古籍全文知识库；</w:t>
+        <w:t>一座可检索、可校勘、可引用的先秦至宋代古代天文与思想知识库；</w:t>
       </w:r>
     </w:p>
     <w:p>
@@ -316,7 +316,7 @@
           <w:color w:val="1F2937"/>
           <w:sz w:val="22"/>
         </w:rPr>
-        <w:t>墨观是一套面向公众的“古典世界分析产品”：先用现代数据确认天空、天气和事件事实，再用公元 220 年以前形成的中国文献解释其结构与变化，最后形成能够被未来事实检验的情景推演。</w:t>
+        <w:t>墨观是一套面向公众的“古典世界分析产品”：先用现代数据确认天空、天气和事件事实，再调用先秦至宋代、经过时代与功能分层的中国文献解释其结构与变化，最后形成能够被未来事实检验的情景推演。</w:t>
       </w:r>
     </w:p>
     <w:p>
@@ -416,7 +416,7 @@
           <w:color w:val="1F2937"/>
           <w:sz w:val="22"/>
         </w:rPr>
-        <w:t>阅读与事件有关的先秦—两汉原典和现代释义；</w:t>
+        <w:t>阅读与事件有关的先秦至宋代原典、时代脉络和现代释义；</w:t>
       </w:r>
     </w:p>
     <w:p>
@@ -1375,7 +1375,7 @@
           <w:color w:val="1F2937"/>
           <w:sz w:val="22"/>
         </w:rPr>
-        <w:t>事实确认后，墨观才调用先秦—两汉文献，分析显隐、动静、扩张、收缩、承载、阻断、转折和失衡。每项解释必须附原典、篇章、原文、年代层级和现代转译。</w:t>
+        <w:t>事实确认后，墨观才调用经过分期准入的古代文献，分析显隐、动静、扩张、收缩、承载、阻断、转折和失衡。每项解释必须附原典、篇章、原文、成书与传世年代、时代层级、材料功能和现代转译。</w:t>
       </w:r>
     </w:p>
     <w:p>
@@ -1988,7 +1988,7 @@
           <w:color w:val="2E74B5"/>
           <w:sz w:val="32"/>
         </w:rPr>
-        <w:t>五、古籍全文知识库</w:t>
+        <w:t>五、古代天文与思想知识库</w:t>
       </w:r>
     </w:p>
     <w:p>
@@ -2002,8 +2002,490 @@
           <w:color w:val="1F2937"/>
           <w:sz w:val="22"/>
         </w:rPr>
-        <w:t>墨观的长期知识底座，是符合准入要求的先秦—两汉古籍全文知识库。公元 220 年是核心理论截止线，后世注疏可以帮助解释，但不能伪装成汉代以前的规则。</w:t>
+        <w:t>墨观的长期知识底座扩展至先秦、两汉、隋唐和两宋。知识库不再设置公元 220 年的单一截止线，而采用“时代分层、功能分型、异说并存”的准入方式。唐宋材料可以参与分析，但必须保留其自身时代背景，不能伪装成先秦或汉代原义。</w:t>
       </w:r>
+    </w:p>
+    <w:p>
+      <w:pPr>
+        <w:pStyle w:val="Heading2"/>
+      </w:pPr>
+      <w:r>
+        <w:rPr>
+          <w:rFonts w:ascii="PingFang SC" w:hAnsi="PingFang SC" w:eastAsia="PingFang SC"/>
+          <w:b/>
+          <w:color w:val="2E74B5"/>
+          <w:sz w:val="26"/>
+        </w:rPr>
+        <w:t>四个历史层级</w:t>
+      </w:r>
+    </w:p>
+    <w:tbl>
+      <w:tblPr>
+        <w:tblW w:type="dxa" w:w="9360"/>
+        <w:jc w:val="left"/>
+        <w:tblLayout w:type="fixed"/>
+        <w:tblLook w:firstColumn="1" w:firstRow="1" w:lastColumn="0" w:lastRow="0" w:noHBand="0" w:noVBand="1" w:val="04A0"/>
+        <w:tblInd w:w="120" w:type="dxa"/>
+      </w:tblPr>
+      <w:tblGrid>
+        <w:gridCol w:w="2050"/>
+        <w:gridCol w:w="3500"/>
+        <w:gridCol w:w="3810"/>
+      </w:tblGrid>
+      <w:tr>
+        <w:trPr>
+          <w:cantSplit/>
+          <w:tblHeader w:val="true"/>
+        </w:trPr>
+        <w:tc>
+          <w:tcPr>
+            <w:tcW w:type="dxa" w:w="2050"/>
+            <w:tcMar>
+              <w:top w:w="80" w:type="dxa"/>
+              <w:bottom w:w="80" w:type="dxa"/>
+              <w:start w:w="120" w:type="dxa"/>
+              <w:end w:w="120" w:type="dxa"/>
+            </w:tcMar>
+            <w:vAlign w:val="center"/>
+            <w:shd w:fill="F2F4F7"/>
+          </w:tcPr>
+          <w:p>
+            <w:pPr>
+              <w:spacing w:before="0" w:after="0" w:line="264" w:lineRule="auto"/>
+              <w:jc w:val="center"/>
+            </w:pPr>
+            <w:r/>
+            <w:r>
+              <w:rPr>
+                <w:rFonts w:ascii="PingFang SC" w:hAnsi="PingFang SC" w:eastAsia="PingFang SC"/>
+                <w:b/>
+                <w:color w:val="0B2545"/>
+                <w:sz w:val="20"/>
+              </w:rPr>
+              <w:t>层级</w:t>
+            </w:r>
+          </w:p>
+        </w:tc>
+        <w:tc>
+          <w:tcPr>
+            <w:tcW w:type="dxa" w:w="3500"/>
+            <w:tcMar>
+              <w:top w:w="80" w:type="dxa"/>
+              <w:bottom w:w="80" w:type="dxa"/>
+              <w:start w:w="120" w:type="dxa"/>
+              <w:end w:w="120" w:type="dxa"/>
+            </w:tcMar>
+            <w:vAlign w:val="center"/>
+            <w:shd w:fill="F2F4F7"/>
+          </w:tcPr>
+          <w:p>
+            <w:pPr>
+              <w:spacing w:before="0" w:after="0" w:line="264" w:lineRule="auto"/>
+              <w:jc w:val="center"/>
+            </w:pPr>
+            <w:r/>
+            <w:r>
+              <w:rPr>
+                <w:rFonts w:ascii="PingFang SC" w:hAnsi="PingFang SC" w:eastAsia="PingFang SC"/>
+                <w:b/>
+                <w:color w:val="0B2545"/>
+                <w:sz w:val="20"/>
+              </w:rPr>
+              <w:t>主要价值</w:t>
+            </w:r>
+          </w:p>
+        </w:tc>
+        <w:tc>
+          <w:tcPr>
+            <w:tcW w:type="dxa" w:w="3810"/>
+            <w:tcMar>
+              <w:top w:w="80" w:type="dxa"/>
+              <w:bottom w:w="80" w:type="dxa"/>
+              <w:start w:w="120" w:type="dxa"/>
+              <w:end w:w="120" w:type="dxa"/>
+            </w:tcMar>
+            <w:vAlign w:val="center"/>
+            <w:shd w:fill="F2F4F7"/>
+          </w:tcPr>
+          <w:p>
+            <w:pPr>
+              <w:spacing w:before="0" w:after="0" w:line="264" w:lineRule="auto"/>
+              <w:jc w:val="center"/>
+            </w:pPr>
+            <w:r/>
+            <w:r>
+              <w:rPr>
+                <w:rFonts w:ascii="PingFang SC" w:hAnsi="PingFang SC" w:eastAsia="PingFang SC"/>
+                <w:b/>
+                <w:color w:val="0B2545"/>
+                <w:sz w:val="20"/>
+              </w:rPr>
+              <w:t>使用边界</w:t>
+            </w:r>
+          </w:p>
+        </w:tc>
+      </w:tr>
+      <w:tr>
+        <w:trPr>
+          <w:cantSplit/>
+        </w:trPr>
+        <w:tc>
+          <w:tcPr>
+            <w:tcW w:type="dxa" w:w="2050"/>
+            <w:tcMar>
+              <w:top w:w="80" w:type="dxa"/>
+              <w:bottom w:w="80" w:type="dxa"/>
+              <w:start w:w="120" w:type="dxa"/>
+              <w:end w:w="120" w:type="dxa"/>
+            </w:tcMar>
+            <w:vAlign w:val="center"/>
+          </w:tcPr>
+          <w:p>
+            <w:pPr>
+              <w:spacing w:before="0" w:after="0" w:line="264" w:lineRule="auto"/>
+              <w:jc w:val="center"/>
+            </w:pPr>
+            <w:r/>
+            <w:r>
+              <w:rPr>
+                <w:rFonts w:ascii="PingFang SC" w:hAnsi="PingFang SC" w:eastAsia="PingFang SC"/>
+                <w:b/>
+                <w:color w:val="1F2937"/>
+                <w:sz w:val="20"/>
+              </w:rPr>
+              <w:t>理论源头层｜先秦—两汉</w:t>
+            </w:r>
+          </w:p>
+        </w:tc>
+        <w:tc>
+          <w:tcPr>
+            <w:tcW w:type="dxa" w:w="3500"/>
+            <w:tcMar>
+              <w:top w:w="80" w:type="dxa"/>
+              <w:bottom w:w="80" w:type="dxa"/>
+              <w:start w:w="120" w:type="dxa"/>
+              <w:end w:w="120" w:type="dxa"/>
+            </w:tcMar>
+            <w:vAlign w:val="center"/>
+          </w:tcPr>
+          <w:p>
+            <w:pPr>
+              <w:spacing w:before="0" w:after="0" w:line="264" w:lineRule="auto"/>
+              <w:jc w:val="left"/>
+            </w:pPr>
+            <w:r/>
+            <w:r>
+              <w:rPr>
+                <w:rFonts w:ascii="PingFang SC" w:hAnsi="PingFang SC" w:eastAsia="PingFang SC"/>
+                <w:b w:val="0"/>
+                <w:color w:val="1F2937"/>
+                <w:sz w:val="20"/>
+              </w:rPr>
+              <w:t>天人关系、阴阳五行、八卦、时序与早期星官体系</w:t>
+            </w:r>
+          </w:p>
+        </w:tc>
+        <w:tc>
+          <w:tcPr>
+            <w:tcW w:type="dxa" w:w="3810"/>
+            <w:tcMar>
+              <w:top w:w="80" w:type="dxa"/>
+              <w:bottom w:w="80" w:type="dxa"/>
+              <w:start w:w="120" w:type="dxa"/>
+              <w:end w:w="120" w:type="dxa"/>
+            </w:tcMar>
+            <w:vAlign w:val="center"/>
+          </w:tcPr>
+          <w:p>
+            <w:pPr>
+              <w:spacing w:before="0" w:after="0" w:line="264" w:lineRule="auto"/>
+              <w:jc w:val="left"/>
+            </w:pPr>
+            <w:r/>
+            <w:r>
+              <w:rPr>
+                <w:rFonts w:ascii="PingFang SC" w:hAnsi="PingFang SC" w:eastAsia="PingFang SC"/>
+                <w:b w:val="0"/>
+                <w:color w:val="1F2937"/>
+                <w:sz w:val="20"/>
+              </w:rPr>
+              <w:t>负责说明概念源流，不因年代早而自动获得更高事实权重</w:t>
+            </w:r>
+          </w:p>
+        </w:tc>
+      </w:tr>
+      <w:tr>
+        <w:trPr>
+          <w:cantSplit/>
+        </w:trPr>
+        <w:tc>
+          <w:tcPr>
+            <w:tcW w:type="dxa" w:w="2050"/>
+            <w:tcMar>
+              <w:top w:w="80" w:type="dxa"/>
+              <w:bottom w:w="80" w:type="dxa"/>
+              <w:start w:w="120" w:type="dxa"/>
+              <w:end w:w="120" w:type="dxa"/>
+            </w:tcMar>
+            <w:vAlign w:val="center"/>
+          </w:tcPr>
+          <w:p>
+            <w:pPr>
+              <w:spacing w:before="0" w:after="0" w:line="264" w:lineRule="auto"/>
+              <w:jc w:val="center"/>
+            </w:pPr>
+            <w:r/>
+            <w:r>
+              <w:rPr>
+                <w:rFonts w:ascii="PingFang SC" w:hAnsi="PingFang SC" w:eastAsia="PingFang SC"/>
+                <w:b/>
+                <w:color w:val="1F2937"/>
+                <w:sz w:val="20"/>
+              </w:rPr>
+              <w:t>制度集成层｜魏晋—隋唐</w:t>
+            </w:r>
+          </w:p>
+        </w:tc>
+        <w:tc>
+          <w:tcPr>
+            <w:tcW w:type="dxa" w:w="3500"/>
+            <w:tcMar>
+              <w:top w:w="80" w:type="dxa"/>
+              <w:bottom w:w="80" w:type="dxa"/>
+              <w:start w:w="120" w:type="dxa"/>
+              <w:end w:w="120" w:type="dxa"/>
+            </w:tcMar>
+            <w:vAlign w:val="center"/>
+          </w:tcPr>
+          <w:p>
+            <w:pPr>
+              <w:spacing w:before="0" w:after="0" w:line="264" w:lineRule="auto"/>
+              <w:jc w:val="left"/>
+            </w:pPr>
+            <w:r/>
+            <w:r>
+              <w:rPr>
+                <w:rFonts w:ascii="PingFang SC" w:hAnsi="PingFang SC" w:eastAsia="PingFang SC"/>
+                <w:b w:val="0"/>
+                <w:color w:val="1F2937"/>
+                <w:sz w:val="20"/>
+              </w:rPr>
+              <w:t>天文志、占候文献、历法制度、文献汇编与跨文化吸收</w:t>
+            </w:r>
+          </w:p>
+        </w:tc>
+        <w:tc>
+          <w:tcPr>
+            <w:tcW w:type="dxa" w:w="3810"/>
+            <w:tcMar>
+              <w:top w:w="80" w:type="dxa"/>
+              <w:bottom w:w="80" w:type="dxa"/>
+              <w:start w:w="120" w:type="dxa"/>
+              <w:end w:w="120" w:type="dxa"/>
+            </w:tcMar>
+            <w:vAlign w:val="center"/>
+          </w:tcPr>
+          <w:p>
+            <w:pPr>
+              <w:spacing w:before="0" w:after="0" w:line="264" w:lineRule="auto"/>
+              <w:jc w:val="left"/>
+            </w:pPr>
+            <w:r/>
+            <w:r>
+              <w:rPr>
+                <w:rFonts w:ascii="PingFang SC" w:hAnsi="PingFang SC" w:eastAsia="PingFang SC"/>
+                <w:b w:val="0"/>
+                <w:color w:val="1F2937"/>
+                <w:sz w:val="20"/>
+              </w:rPr>
+              <w:t>必须区分本土传统、印度及中亚输入，以及后世整理成分</w:t>
+            </w:r>
+          </w:p>
+        </w:tc>
+      </w:tr>
+      <w:tr>
+        <w:trPr>
+          <w:cantSplit/>
+        </w:trPr>
+        <w:tc>
+          <w:tcPr>
+            <w:tcW w:type="dxa" w:w="2050"/>
+            <w:tcMar>
+              <w:top w:w="80" w:type="dxa"/>
+              <w:bottom w:w="80" w:type="dxa"/>
+              <w:start w:w="120" w:type="dxa"/>
+              <w:end w:w="120" w:type="dxa"/>
+            </w:tcMar>
+            <w:vAlign w:val="center"/>
+          </w:tcPr>
+          <w:p>
+            <w:pPr>
+              <w:spacing w:before="0" w:after="0" w:line="264" w:lineRule="auto"/>
+              <w:jc w:val="center"/>
+            </w:pPr>
+            <w:r/>
+            <w:r>
+              <w:rPr>
+                <w:rFonts w:ascii="PingFang SC" w:hAnsi="PingFang SC" w:eastAsia="PingFang SC"/>
+                <w:b/>
+                <w:color w:val="1F2937"/>
+                <w:sz w:val="20"/>
+              </w:rPr>
+              <w:t>观测精化层｜两宋</w:t>
+            </w:r>
+          </w:p>
+        </w:tc>
+        <w:tc>
+          <w:tcPr>
+            <w:tcW w:type="dxa" w:w="3500"/>
+            <w:tcMar>
+              <w:top w:w="80" w:type="dxa"/>
+              <w:bottom w:w="80" w:type="dxa"/>
+              <w:start w:w="120" w:type="dxa"/>
+              <w:end w:w="120" w:type="dxa"/>
+            </w:tcMar>
+            <w:vAlign w:val="center"/>
+          </w:tcPr>
+          <w:p>
+            <w:pPr>
+              <w:spacing w:before="0" w:after="0" w:line="264" w:lineRule="auto"/>
+              <w:jc w:val="left"/>
+            </w:pPr>
+            <w:r/>
+            <w:r>
+              <w:rPr>
+                <w:rFonts w:ascii="PingFang SC" w:hAnsi="PingFang SC" w:eastAsia="PingFang SC"/>
+                <w:b w:val="0"/>
+                <w:color w:val="1F2937"/>
+                <w:sz w:val="20"/>
+              </w:rPr>
+              <w:t>星图、客星与彗星记录、历法修订、仪器和官署方法</w:t>
+            </w:r>
+          </w:p>
+        </w:tc>
+        <w:tc>
+          <w:tcPr>
+            <w:tcW w:type="dxa" w:w="3810"/>
+            <w:tcMar>
+              <w:top w:w="80" w:type="dxa"/>
+              <w:bottom w:w="80" w:type="dxa"/>
+              <w:start w:w="120" w:type="dxa"/>
+              <w:end w:w="120" w:type="dxa"/>
+            </w:tcMar>
+            <w:vAlign w:val="center"/>
+          </w:tcPr>
+          <w:p>
+            <w:pPr>
+              <w:spacing w:before="0" w:after="0" w:line="264" w:lineRule="auto"/>
+              <w:jc w:val="left"/>
+            </w:pPr>
+            <w:r/>
+            <w:r>
+              <w:rPr>
+                <w:rFonts w:ascii="PingFang SC" w:hAnsi="PingFang SC" w:eastAsia="PingFang SC"/>
+                <w:b w:val="0"/>
+                <w:color w:val="1F2937"/>
+                <w:sz w:val="20"/>
+              </w:rPr>
+              <w:t>观测记录可作为历史数据，术数解释仍须单独标注</w:t>
+            </w:r>
+          </w:p>
+        </w:tc>
+      </w:tr>
+      <w:tr>
+        <w:trPr>
+          <w:cantSplit/>
+        </w:trPr>
+        <w:tc>
+          <w:tcPr>
+            <w:tcW w:type="dxa" w:w="2050"/>
+            <w:tcMar>
+              <w:top w:w="80" w:type="dxa"/>
+              <w:bottom w:w="80" w:type="dxa"/>
+              <w:start w:w="120" w:type="dxa"/>
+              <w:end w:w="120" w:type="dxa"/>
+            </w:tcMar>
+            <w:vAlign w:val="center"/>
+          </w:tcPr>
+          <w:p>
+            <w:pPr>
+              <w:spacing w:before="0" w:after="0" w:line="264" w:lineRule="auto"/>
+              <w:jc w:val="center"/>
+            </w:pPr>
+            <w:r/>
+            <w:r>
+              <w:rPr>
+                <w:rFonts w:ascii="PingFang SC" w:hAnsi="PingFang SC" w:eastAsia="PingFang SC"/>
+                <w:b/>
+                <w:color w:val="1F2937"/>
+                <w:sz w:val="20"/>
+              </w:rPr>
+              <w:t>现代校验层｜当代</w:t>
+            </w:r>
+          </w:p>
+        </w:tc>
+        <w:tc>
+          <w:tcPr>
+            <w:tcW w:type="dxa" w:w="3500"/>
+            <w:tcMar>
+              <w:top w:w="80" w:type="dxa"/>
+              <w:bottom w:w="80" w:type="dxa"/>
+              <w:start w:w="120" w:type="dxa"/>
+              <w:end w:w="120" w:type="dxa"/>
+            </w:tcMar>
+            <w:vAlign w:val="center"/>
+          </w:tcPr>
+          <w:p>
+            <w:pPr>
+              <w:spacing w:before="0" w:after="0" w:line="264" w:lineRule="auto"/>
+              <w:jc w:val="left"/>
+            </w:pPr>
+            <w:r/>
+            <w:r>
+              <w:rPr>
+                <w:rFonts w:ascii="PingFang SC" w:hAnsi="PingFang SC" w:eastAsia="PingFang SC"/>
+                <w:b w:val="0"/>
+                <w:color w:val="1F2937"/>
+                <w:sz w:val="20"/>
+              </w:rPr>
+              <w:t>现代星历、天气、历史研究与文本校勘</w:t>
+            </w:r>
+          </w:p>
+        </w:tc>
+        <w:tc>
+          <w:tcPr>
+            <w:tcW w:type="dxa" w:w="3810"/>
+            <w:tcMar>
+              <w:top w:w="80" w:type="dxa"/>
+              <w:bottom w:w="80" w:type="dxa"/>
+              <w:start w:w="120" w:type="dxa"/>
+              <w:end w:w="120" w:type="dxa"/>
+            </w:tcMar>
+            <w:vAlign w:val="center"/>
+          </w:tcPr>
+          <w:p>
+            <w:pPr>
+              <w:spacing w:before="0" w:after="0" w:line="264" w:lineRule="auto"/>
+              <w:jc w:val="left"/>
+            </w:pPr>
+            <w:r/>
+            <w:r>
+              <w:rPr>
+                <w:rFonts w:ascii="PingFang SC" w:hAnsi="PingFang SC" w:eastAsia="PingFang SC"/>
+                <w:b w:val="0"/>
+                <w:color w:val="1F2937"/>
+                <w:sz w:val="20"/>
+              </w:rPr>
+              <w:t>只用于确认事实、版本和解释边界，不为古代因果背书</w:t>
+            </w:r>
+          </w:p>
+        </w:tc>
+      </w:tr>
+    </w:tbl>
+    <w:p>
+      <w:pPr>
+        <w:spacing w:before="0" w:after="40"/>
+      </w:pPr>
     </w:p>
     <w:p>
       <w:pPr>
@@ -2409,7 +2891,130 @@
           <w:color w:val="1F2937"/>
           <w:sz w:val="22"/>
         </w:rPr>
-        <w:t>首批文献包括《易传》《尚书·洪范》《吕氏春秋》《淮南子》《史记》和《论衡》。其中《论衡》承担强制反证作用，防止产品只收集支持天人感应的材料。</w:t>
+        <w:t>首批知识库按三批建设：</w:t>
+      </w:r>
+    </w:p>
+    <w:p>
+      <w:pPr>
+        <w:numPr>
+          <w:ilvl w:val="0"/>
+          <w:numId w:val="16"/>
+        </w:numPr>
+        <w:spacing w:after="160" w:line="280" w:lineRule="auto"/>
+      </w:pPr>
+      <w:r>
+        <w:rPr>
+          <w:rFonts w:ascii="PingFang SC" w:hAnsi="PingFang SC" w:eastAsia="PingFang SC"/>
+          <w:b/>
+          <w:color w:val="1F2937"/>
+          <w:sz w:val="22"/>
+        </w:rPr>
+        <w:t>源头批</w:t>
+      </w:r>
+      <w:r>
+        <w:rPr>
+          <w:rFonts w:ascii="PingFang SC" w:hAnsi="PingFang SC" w:eastAsia="PingFang SC"/>
+          <w:b w:val="0"/>
+          <w:color w:val="1F2937"/>
+          <w:sz w:val="22"/>
+        </w:rPr>
+        <w:t>：《易传》《尚书·洪范》《吕氏春秋》《淮南子》《史记·天官书》和《论衡》。其中《论衡》承担强制反证作用；</w:t>
+      </w:r>
+    </w:p>
+    <w:p>
+      <w:pPr>
+        <w:numPr>
+          <w:ilvl w:val="0"/>
+          <w:numId w:val="16"/>
+        </w:numPr>
+        <w:spacing w:after="160" w:line="280" w:lineRule="auto"/>
+      </w:pPr>
+      <w:r>
+        <w:rPr>
+          <w:rFonts w:ascii="PingFang SC" w:hAnsi="PingFang SC" w:eastAsia="PingFang SC"/>
+          <w:b/>
+          <w:color w:val="1F2937"/>
+          <w:sz w:val="22"/>
+        </w:rPr>
+        <w:t>唐代集成批</w:t>
+      </w:r>
+      <w:r>
+        <w:rPr>
+          <w:rFonts w:ascii="PingFang SC" w:hAnsi="PingFang SC" w:eastAsia="PingFang SC"/>
+          <w:b w:val="0"/>
+          <w:color w:val="1F2937"/>
+          <w:sz w:val="22"/>
+        </w:rPr>
+        <w:t>：《晋书·天文志》《隋书·天文志》《乙巳占》《开元占经》《大衍历》相关材料，以及能够确认来源和译传关系的七曜、宿曜文献；</w:t>
+      </w:r>
+    </w:p>
+    <w:p>
+      <w:pPr>
+        <w:numPr>
+          <w:ilvl w:val="0"/>
+          <w:numId w:val="16"/>
+        </w:numPr>
+        <w:spacing w:after="160" w:line="280" w:lineRule="auto"/>
+      </w:pPr>
+      <w:r>
+        <w:rPr>
+          <w:rFonts w:ascii="PingFang SC" w:hAnsi="PingFang SC" w:eastAsia="PingFang SC"/>
+          <w:b/>
+          <w:color w:val="1F2937"/>
+          <w:sz w:val="22"/>
+        </w:rPr>
+        <w:t>宋代观测批</w:t>
+      </w:r>
+      <w:r>
+        <w:rPr>
+          <w:rFonts w:ascii="PingFang SC" w:hAnsi="PingFang SC" w:eastAsia="PingFang SC"/>
+          <w:b w:val="0"/>
+          <w:color w:val="1F2937"/>
+          <w:sz w:val="22"/>
+        </w:rPr>
+        <w:t>：《新仪象法要》、宋代星图与客星记录、《梦溪笔谈》天文历法条目，以及《宋史·天文志》中可追溯至宋代原始记录的材料。</w:t>
+      </w:r>
+    </w:p>
+    <w:p>
+      <w:pPr>
+        <w:spacing w:after="120" w:line="264" w:lineRule="auto"/>
+      </w:pPr>
+      <w:r>
+        <w:rPr>
+          <w:rFonts w:ascii="PingFang SC" w:hAnsi="PingFang SC" w:eastAsia="PingFang SC"/>
+          <w:b w:val="0"/>
+          <w:color w:val="1F2937"/>
+          <w:sz w:val="22"/>
+        </w:rPr>
+        <w:t>《宋史》成书于元代，不能直接标记为宋代成书文献；系统必须同时记录“事件发生年代、原始记录年代、现存文本编纂年代和当前底本年代”。</w:t>
+      </w:r>
+    </w:p>
+    <w:p>
+      <w:pPr>
+        <w:pStyle w:val="Heading2"/>
+      </w:pPr>
+      <w:r>
+        <w:rPr>
+          <w:rFonts w:ascii="PingFang SC" w:hAnsi="PingFang SC" w:eastAsia="PingFang SC"/>
+          <w:b/>
+          <w:color w:val="2E74B5"/>
+          <w:sz w:val="26"/>
+        </w:rPr>
+        <w:t>材料功能标签</w:t>
+      </w:r>
+    </w:p>
+    <w:p>
+      <w:pPr>
+        <w:spacing w:after="120" w:line="264" w:lineRule="auto"/>
+      </w:pPr>
+      <w:r>
+        <w:rPr>
+          <w:rFonts w:ascii="PingFang SC" w:hAnsi="PingFang SC" w:eastAsia="PingFang SC"/>
+          <w:b w:val="0"/>
+          <w:color w:val="1F2937"/>
+          <w:sz w:val="22"/>
+        </w:rPr>
+        <w:t>每一条文献片段必须标记其主要功能：理论、占候、观测、历法、仪器、制度、史例或后世评论。观测记录不能自动生成占候结论，占候文本也不能被当作现代天文事实。</w:t>
       </w:r>
     </w:p>
     <w:p>
@@ -2444,7 +3049,7 @@
       <w:pPr>
         <w:numPr>
           <w:ilvl w:val="0"/>
-          <w:numId w:val="16"/>
+          <w:numId w:val="17"/>
         </w:numPr>
         <w:spacing w:after="160" w:line="280" w:lineRule="auto"/>
       </w:pPr>
@@ -2462,7 +3067,7 @@
       <w:pPr>
         <w:numPr>
           <w:ilvl w:val="0"/>
-          <w:numId w:val="16"/>
+          <w:numId w:val="17"/>
         </w:numPr>
         <w:spacing w:after="160" w:line="280" w:lineRule="auto"/>
       </w:pPr>
@@ -2480,7 +3085,7 @@
       <w:pPr>
         <w:numPr>
           <w:ilvl w:val="0"/>
-          <w:numId w:val="16"/>
+          <w:numId w:val="17"/>
         </w:numPr>
         <w:spacing w:after="160" w:line="280" w:lineRule="auto"/>
       </w:pPr>
@@ -2498,7 +3103,7 @@
       <w:pPr>
         <w:numPr>
           <w:ilvl w:val="0"/>
-          <w:numId w:val="16"/>
+          <w:numId w:val="17"/>
         </w:numPr>
         <w:spacing w:after="160" w:line="280" w:lineRule="auto"/>
       </w:pPr>
@@ -2516,7 +3121,7 @@
       <w:pPr>
         <w:numPr>
           <w:ilvl w:val="0"/>
-          <w:numId w:val="16"/>
+          <w:numId w:val="17"/>
         </w:numPr>
         <w:spacing w:after="160" w:line="280" w:lineRule="auto"/>
       </w:pPr>
@@ -2576,7 +3181,7 @@
       <w:pPr>
         <w:numPr>
           <w:ilvl w:val="0"/>
-          <w:numId w:val="17"/>
+          <w:numId w:val="18"/>
         </w:numPr>
         <w:spacing w:after="160" w:line="280" w:lineRule="auto"/>
       </w:pPr>
@@ -2594,7 +3199,7 @@
       <w:pPr>
         <w:numPr>
           <w:ilvl w:val="0"/>
-          <w:numId w:val="17"/>
+          <w:numId w:val="18"/>
         </w:numPr>
         <w:spacing w:after="160" w:line="280" w:lineRule="auto"/>
       </w:pPr>
@@ -2612,7 +3217,7 @@
       <w:pPr>
         <w:numPr>
           <w:ilvl w:val="0"/>
-          <w:numId w:val="17"/>
+          <w:numId w:val="18"/>
         </w:numPr>
         <w:spacing w:after="160" w:line="280" w:lineRule="auto"/>
       </w:pPr>
@@ -2630,7 +3235,7 @@
       <w:pPr>
         <w:numPr>
           <w:ilvl w:val="0"/>
-          <w:numId w:val="17"/>
+          <w:numId w:val="18"/>
         </w:numPr>
         <w:spacing w:after="160" w:line="280" w:lineRule="auto"/>
       </w:pPr>
@@ -2662,7 +3267,7 @@
       <w:pPr>
         <w:numPr>
           <w:ilvl w:val="0"/>
-          <w:numId w:val="18"/>
+          <w:numId w:val="19"/>
         </w:numPr>
         <w:spacing w:after="160" w:line="280" w:lineRule="auto"/>
       </w:pPr>
@@ -2680,7 +3285,7 @@
       <w:pPr>
         <w:numPr>
           <w:ilvl w:val="0"/>
-          <w:numId w:val="18"/>
+          <w:numId w:val="19"/>
         </w:numPr>
         <w:spacing w:after="160" w:line="280" w:lineRule="auto"/>
       </w:pPr>
@@ -2698,7 +3303,7 @@
       <w:pPr>
         <w:numPr>
           <w:ilvl w:val="0"/>
-          <w:numId w:val="18"/>
+          <w:numId w:val="19"/>
         </w:numPr>
         <w:spacing w:after="160" w:line="280" w:lineRule="auto"/>
       </w:pPr>
@@ -2716,7 +3321,7 @@
       <w:pPr>
         <w:numPr>
           <w:ilvl w:val="0"/>
-          <w:numId w:val="18"/>
+          <w:numId w:val="19"/>
         </w:numPr>
         <w:spacing w:after="160" w:line="280" w:lineRule="auto"/>
       </w:pPr>
@@ -2734,7 +3339,7 @@
       <w:pPr>
         <w:numPr>
           <w:ilvl w:val="0"/>
-          <w:numId w:val="18"/>
+          <w:numId w:val="19"/>
         </w:numPr>
         <w:spacing w:after="160" w:line="280" w:lineRule="auto"/>
       </w:pPr>
@@ -2794,7 +3399,7 @@
       <w:pPr>
         <w:numPr>
           <w:ilvl w:val="0"/>
-          <w:numId w:val="19"/>
+          <w:numId w:val="20"/>
         </w:numPr>
         <w:spacing w:after="160" w:line="280" w:lineRule="auto"/>
       </w:pPr>
@@ -2821,7 +3426,7 @@
       <w:pPr>
         <w:numPr>
           <w:ilvl w:val="0"/>
-          <w:numId w:val="19"/>
+          <w:numId w:val="20"/>
         </w:numPr>
         <w:spacing w:after="160" w:line="280" w:lineRule="auto"/>
       </w:pPr>
@@ -2848,7 +3453,7 @@
       <w:pPr>
         <w:numPr>
           <w:ilvl w:val="0"/>
-          <w:numId w:val="19"/>
+          <w:numId w:val="20"/>
         </w:numPr>
         <w:spacing w:after="160" w:line="280" w:lineRule="auto"/>
       </w:pPr>
@@ -2875,7 +3480,7 @@
       <w:pPr>
         <w:numPr>
           <w:ilvl w:val="0"/>
-          <w:numId w:val="19"/>
+          <w:numId w:val="20"/>
         </w:numPr>
         <w:spacing w:after="160" w:line="280" w:lineRule="auto"/>
       </w:pPr>
@@ -2902,7 +3507,7 @@
       <w:pPr>
         <w:numPr>
           <w:ilvl w:val="0"/>
-          <w:numId w:val="19"/>
+          <w:numId w:val="20"/>
         </w:numPr>
         <w:spacing w:after="160" w:line="280" w:lineRule="auto"/>
       </w:pPr>
@@ -2983,7 +3588,7 @@
           <w:color w:val="0B2545"/>
           <w:sz w:val="23"/>
         </w:rPr>
-        <w:t>用户是否愿意从中国古代星空进入地球，在同一条体验中查看真实天气、三件世界事件及先秦—两汉分析，并愿意第二天再次回来？</w:t>
+        <w:t>用户是否愿意从中国古代星空进入地球，在同一条体验中查看真实天气、三件世界事件及先秦至宋代的分层分析，并愿意第二天再次回来？</w:t>
       </w:r>
     </w:p>
     <w:p>
@@ -3018,7 +3623,7 @@
       <w:pPr>
         <w:numPr>
           <w:ilvl w:val="0"/>
-          <w:numId w:val="20"/>
+          <w:numId w:val="21"/>
         </w:numPr>
         <w:spacing w:after="160" w:line="280" w:lineRule="auto"/>
       </w:pPr>
@@ -3036,7 +3641,7 @@
       <w:pPr>
         <w:numPr>
           <w:ilvl w:val="0"/>
-          <w:numId w:val="20"/>
+          <w:numId w:val="21"/>
         </w:numPr>
         <w:spacing w:after="160" w:line="280" w:lineRule="auto"/>
       </w:pPr>
@@ -3054,7 +3659,7 @@
       <w:pPr>
         <w:numPr>
           <w:ilvl w:val="0"/>
-          <w:numId w:val="20"/>
+          <w:numId w:val="21"/>
         </w:numPr>
         <w:spacing w:after="160" w:line="280" w:lineRule="auto"/>
       </w:pPr>
@@ -3072,7 +3677,7 @@
       <w:pPr>
         <w:numPr>
           <w:ilvl w:val="0"/>
-          <w:numId w:val="20"/>
+          <w:numId w:val="21"/>
         </w:numPr>
         <w:spacing w:after="160" w:line="280" w:lineRule="auto"/>
       </w:pPr>
@@ -3090,7 +3695,7 @@
       <w:pPr>
         <w:numPr>
           <w:ilvl w:val="0"/>
-          <w:numId w:val="20"/>
+          <w:numId w:val="21"/>
         </w:numPr>
         <w:spacing w:after="160" w:line="280" w:lineRule="auto"/>
       </w:pPr>
@@ -3108,7 +3713,7 @@
       <w:pPr>
         <w:numPr>
           <w:ilvl w:val="0"/>
-          <w:numId w:val="20"/>
+          <w:numId w:val="21"/>
         </w:numPr>
         <w:spacing w:after="160" w:line="280" w:lineRule="auto"/>
       </w:pPr>
@@ -3126,7 +3731,7 @@
       <w:pPr>
         <w:numPr>
           <w:ilvl w:val="0"/>
-          <w:numId w:val="20"/>
+          <w:numId w:val="21"/>
         </w:numPr>
         <w:spacing w:after="160" w:line="280" w:lineRule="auto"/>
       </w:pPr>
@@ -3144,7 +3749,7 @@
       <w:pPr>
         <w:numPr>
           <w:ilvl w:val="0"/>
-          <w:numId w:val="20"/>
+          <w:numId w:val="21"/>
         </w:numPr>
         <w:spacing w:after="160" w:line="280" w:lineRule="auto"/>
       </w:pPr>
@@ -3176,7 +3781,7 @@
       <w:pPr>
         <w:numPr>
           <w:ilvl w:val="0"/>
-          <w:numId w:val="21"/>
+          <w:numId w:val="22"/>
         </w:numPr>
         <w:spacing w:after="160" w:line="280" w:lineRule="auto"/>
       </w:pPr>
@@ -3194,7 +3799,7 @@
       <w:pPr>
         <w:numPr>
           <w:ilvl w:val="0"/>
-          <w:numId w:val="21"/>
+          <w:numId w:val="22"/>
         </w:numPr>
         <w:spacing w:after="160" w:line="280" w:lineRule="auto"/>
       </w:pPr>
@@ -3212,7 +3817,7 @@
       <w:pPr>
         <w:numPr>
           <w:ilvl w:val="0"/>
-          <w:numId w:val="21"/>
+          <w:numId w:val="22"/>
         </w:numPr>
         <w:spacing w:after="160" w:line="280" w:lineRule="auto"/>
       </w:pPr>
@@ -3230,7 +3835,7 @@
       <w:pPr>
         <w:numPr>
           <w:ilvl w:val="0"/>
-          <w:numId w:val="21"/>
+          <w:numId w:val="22"/>
         </w:numPr>
         <w:spacing w:after="160" w:line="280" w:lineRule="auto"/>
       </w:pPr>
@@ -3248,7 +3853,7 @@
       <w:pPr>
         <w:numPr>
           <w:ilvl w:val="0"/>
-          <w:numId w:val="21"/>
+          <w:numId w:val="22"/>
         </w:numPr>
         <w:spacing w:after="160" w:line="280" w:lineRule="auto"/>
       </w:pPr>
@@ -3266,7 +3871,7 @@
       <w:pPr>
         <w:numPr>
           <w:ilvl w:val="0"/>
-          <w:numId w:val="21"/>
+          <w:numId w:val="22"/>
         </w:numPr>
         <w:spacing w:after="160" w:line="280" w:lineRule="auto"/>
       </w:pPr>
@@ -3284,7 +3889,7 @@
       <w:pPr>
         <w:numPr>
           <w:ilvl w:val="0"/>
-          <w:numId w:val="21"/>
+          <w:numId w:val="22"/>
         </w:numPr>
         <w:spacing w:after="160" w:line="280" w:lineRule="auto"/>
       </w:pPr>
@@ -3526,7 +4131,7 @@
       <w:pPr>
         <w:numPr>
           <w:ilvl w:val="0"/>
-          <w:numId w:val="22"/>
+          <w:numId w:val="23"/>
         </w:numPr>
         <w:spacing w:after="160" w:line="280" w:lineRule="auto"/>
       </w:pPr>
@@ -3537,14 +4142,50 @@
           <w:color w:val="1F2937"/>
           <w:sz w:val="22"/>
         </w:rPr>
-        <w:t>核心规则只直接采用公元 220 年以前形成的文献；</w:t>
+        <w:t>文献范围扩展至宋代结束，但每条材料必须标注时代、功能、底本和传承关系；</w:t>
       </w:r>
     </w:p>
     <w:p>
       <w:pPr>
         <w:numPr>
           <w:ilvl w:val="0"/>
-          <w:numId w:val="22"/>
+          <w:numId w:val="23"/>
+        </w:numPr>
+        <w:spacing w:after="160" w:line="280" w:lineRule="auto"/>
+      </w:pPr>
+      <w:r>
+        <w:rPr>
+          <w:rFonts w:ascii="PingFang SC" w:hAnsi="PingFang SC" w:eastAsia="PingFang SC"/>
+          <w:b w:val="0"/>
+          <w:color w:val="1F2937"/>
+          <w:sz w:val="22"/>
+        </w:rPr>
+        <w:t>唐宋材料不得倒置为先秦—两汉原义，不同历史体系不得无标记混用；</w:t>
+      </w:r>
+    </w:p>
+    <w:p>
+      <w:pPr>
+        <w:numPr>
+          <w:ilvl w:val="0"/>
+          <w:numId w:val="23"/>
+        </w:numPr>
+        <w:spacing w:after="160" w:line="280" w:lineRule="auto"/>
+      </w:pPr>
+      <w:r>
+        <w:rPr>
+          <w:rFonts w:ascii="PingFang SC" w:hAnsi="PingFang SC" w:eastAsia="PingFang SC"/>
+          <w:b w:val="0"/>
+          <w:color w:val="1F2937"/>
+          <w:sz w:val="22"/>
+        </w:rPr>
+        <w:t>观测、历法、仪器、制度与占候材料必须分型保存和调用；</w:t>
+      </w:r>
+    </w:p>
+    <w:p>
+      <w:pPr>
+        <w:numPr>
+          <w:ilvl w:val="0"/>
+          <w:numId w:val="23"/>
         </w:numPr>
         <w:spacing w:after="160" w:line="280" w:lineRule="auto"/>
       </w:pPr>
@@ -3562,7 +4203,7 @@
       <w:pPr>
         <w:numPr>
           <w:ilvl w:val="0"/>
-          <w:numId w:val="22"/>
+          <w:numId w:val="23"/>
         </w:numPr>
         <w:spacing w:after="160" w:line="280" w:lineRule="auto"/>
       </w:pPr>
@@ -3580,7 +4221,7 @@
       <w:pPr>
         <w:numPr>
           <w:ilvl w:val="0"/>
-          <w:numId w:val="22"/>
+          <w:numId w:val="23"/>
         </w:numPr>
         <w:spacing w:after="160" w:line="280" w:lineRule="auto"/>
       </w:pPr>
@@ -3598,7 +4239,7 @@
       <w:pPr>
         <w:numPr>
           <w:ilvl w:val="0"/>
-          <w:numId w:val="22"/>
+          <w:numId w:val="23"/>
         </w:numPr>
         <w:spacing w:after="160" w:line="280" w:lineRule="auto"/>
       </w:pPr>
@@ -3616,7 +4257,7 @@
       <w:pPr>
         <w:numPr>
           <w:ilvl w:val="0"/>
-          <w:numId w:val="22"/>
+          <w:numId w:val="23"/>
         </w:numPr>
         <w:spacing w:after="160" w:line="280" w:lineRule="auto"/>
       </w:pPr>
@@ -3634,7 +4275,7 @@
       <w:pPr>
         <w:numPr>
           <w:ilvl w:val="0"/>
-          <w:numId w:val="22"/>
+          <w:numId w:val="23"/>
         </w:numPr>
         <w:spacing w:after="160" w:line="280" w:lineRule="auto"/>
       </w:pPr>
@@ -3652,7 +4293,7 @@
       <w:pPr>
         <w:numPr>
           <w:ilvl w:val="0"/>
-          <w:numId w:val="22"/>
+          <w:numId w:val="23"/>
         </w:numPr>
         <w:spacing w:after="160" w:line="280" w:lineRule="auto"/>
       </w:pPr>
@@ -3670,7 +4311,7 @@
       <w:pPr>
         <w:numPr>
           <w:ilvl w:val="0"/>
-          <w:numId w:val="22"/>
+          <w:numId w:val="23"/>
         </w:numPr>
         <w:spacing w:after="160" w:line="280" w:lineRule="auto"/>
       </w:pPr>
@@ -3688,7 +4329,7 @@
       <w:pPr>
         <w:numPr>
           <w:ilvl w:val="0"/>
-          <w:numId w:val="22"/>
+          <w:numId w:val="23"/>
         </w:numPr>
         <w:spacing w:after="160" w:line="280" w:lineRule="auto"/>
       </w:pPr>
@@ -3706,7 +4347,7 @@
       <w:pPr>
         <w:numPr>
           <w:ilvl w:val="0"/>
-          <w:numId w:val="22"/>
+          <w:numId w:val="23"/>
         </w:numPr>
         <w:spacing w:after="160" w:line="280" w:lineRule="auto"/>
       </w:pPr>
@@ -3724,7 +4365,7 @@
       <w:pPr>
         <w:numPr>
           <w:ilvl w:val="0"/>
-          <w:numId w:val="22"/>
+          <w:numId w:val="23"/>
         </w:numPr>
         <w:spacing w:after="160" w:line="280" w:lineRule="auto"/>
       </w:pPr>
@@ -4145,7 +4786,7 @@
     </w:lvlOverride>
   </w:num>
   <w:num w:numId="16">
-    <w:abstractNumId w:val="9"/>
+    <w:abstractNumId w:val="10"/>
     <w:lvlOverride w:ilvl="0">
       <w:startOverride w:val="1"/>
     </w:lvlOverride>
@@ -4169,18 +4810,24 @@
     </w:lvlOverride>
   </w:num>
   <w:num w:numId="20">
+    <w:abstractNumId w:val="9"/>
+    <w:lvlOverride w:ilvl="0">
+      <w:startOverride w:val="1"/>
+    </w:lvlOverride>
+  </w:num>
+  <w:num w:numId="21">
     <w:abstractNumId w:val="10"/>
     <w:lvlOverride w:ilvl="0">
       <w:startOverride w:val="1"/>
     </w:lvlOverride>
   </w:num>
-  <w:num w:numId="21">
+  <w:num w:numId="22">
     <w:abstractNumId w:val="9"/>
     <w:lvlOverride w:ilvl="0">
       <w:startOverride w:val="1"/>
     </w:lvlOverride>
   </w:num>
-  <w:num w:numId="22">
+  <w:num w:numId="23">
     <w:abstractNumId w:val="10"/>
     <w:lvlOverride w:ilvl="0">
       <w:startOverride w:val="1"/>

</xml_diff>

<commit_message>
Add public health event selection framework
</commit_message>
<xml_diff>
--- a/docs/墨观产品定义框架与愿景.docx
+++ b/docs/墨观产品定义框架与愿景.docx
@@ -1352,6 +1352,142 @@
     </w:p>
     <w:p>
       <w:pPr>
+        <w:spacing w:after="120" w:line="264" w:lineRule="auto"/>
+      </w:pPr>
+      <w:r>
+        <w:rPr>
+          <w:rFonts w:ascii="PingFang SC" w:hAnsi="PingFang SC" w:eastAsia="PingFang SC"/>
+          <w:b w:val="0"/>
+          <w:color w:val="1F2937"/>
+          <w:sz w:val="22"/>
+        </w:rPr>
+        <w:t>每日候选事件来自四个事件池：</w:t>
+      </w:r>
+    </w:p>
+    <w:p>
+      <w:pPr>
+        <w:numPr>
+          <w:ilvl w:val="0"/>
+          <w:numId w:val="13"/>
+        </w:numPr>
+        <w:spacing w:after="160" w:line="280" w:lineRule="auto"/>
+      </w:pPr>
+      <w:r>
+        <w:rPr>
+          <w:rFonts w:ascii="PingFang SC" w:hAnsi="PingFang SC" w:eastAsia="PingFang SC"/>
+          <w:b/>
+          <w:color w:val="1F2937"/>
+          <w:sz w:val="22"/>
+        </w:rPr>
+        <w:t>天地之变</w:t>
+      </w:r>
+      <w:r>
+        <w:rPr>
+          <w:rFonts w:ascii="PingFang SC" w:hAnsi="PingFang SC" w:eastAsia="PingFang SC"/>
+          <w:b w:val="0"/>
+          <w:color w:val="1F2937"/>
+          <w:sz w:val="22"/>
+        </w:rPr>
+        <w:t>：气候、地震、旱涝和异常自然现象；</w:t>
+      </w:r>
+    </w:p>
+    <w:p>
+      <w:pPr>
+        <w:numPr>
+          <w:ilvl w:val="0"/>
+          <w:numId w:val="13"/>
+        </w:numPr>
+        <w:spacing w:after="160" w:line="280" w:lineRule="auto"/>
+      </w:pPr>
+      <w:r>
+        <w:rPr>
+          <w:rFonts w:ascii="PingFang SC" w:hAnsi="PingFang SC" w:eastAsia="PingFang SC"/>
+          <w:b/>
+          <w:color w:val="1F2937"/>
+          <w:sz w:val="22"/>
+        </w:rPr>
+        <w:t>生民之变</w:t>
+      </w:r>
+      <w:r>
+        <w:rPr>
+          <w:rFonts w:ascii="PingFang SC" w:hAnsi="PingFang SC" w:eastAsia="PingFang SC"/>
+          <w:b w:val="0"/>
+          <w:color w:val="1F2937"/>
+          <w:sz w:val="22"/>
+        </w:rPr>
+        <w:t>：疫情、公共卫生、人口迁移、粮食与基本生存条件；</w:t>
+      </w:r>
+    </w:p>
+    <w:p>
+      <w:pPr>
+        <w:numPr>
+          <w:ilvl w:val="0"/>
+          <w:numId w:val="13"/>
+        </w:numPr>
+        <w:spacing w:after="160" w:line="280" w:lineRule="auto"/>
+      </w:pPr>
+      <w:r>
+        <w:rPr>
+          <w:rFonts w:ascii="PingFang SC" w:hAnsi="PingFang SC" w:eastAsia="PingFang SC"/>
+          <w:b/>
+          <w:color w:val="1F2937"/>
+          <w:sz w:val="22"/>
+        </w:rPr>
+        <w:t>天下之变</w:t>
+      </w:r>
+      <w:r>
+        <w:rPr>
+          <w:rFonts w:ascii="PingFang SC" w:hAnsi="PingFang SC" w:eastAsia="PingFang SC"/>
+          <w:b w:val="0"/>
+          <w:color w:val="1F2937"/>
+          <w:sz w:val="22"/>
+        </w:rPr>
+        <w:t>：政治、外交、战争和社会秩序；</w:t>
+      </w:r>
+    </w:p>
+    <w:p>
+      <w:pPr>
+        <w:numPr>
+          <w:ilvl w:val="0"/>
+          <w:numId w:val="13"/>
+        </w:numPr>
+        <w:spacing w:after="160" w:line="280" w:lineRule="auto"/>
+      </w:pPr>
+      <w:r>
+        <w:rPr>
+          <w:rFonts w:ascii="PingFang SC" w:hAnsi="PingFang SC" w:eastAsia="PingFang SC"/>
+          <w:b/>
+          <w:color w:val="1F2937"/>
+          <w:sz w:val="22"/>
+        </w:rPr>
+        <w:t>流通之变</w:t>
+      </w:r>
+      <w:r>
+        <w:rPr>
+          <w:rFonts w:ascii="PingFang SC" w:hAnsi="PingFang SC" w:eastAsia="PingFang SC"/>
+          <w:b w:val="0"/>
+          <w:color w:val="1F2937"/>
+          <w:sz w:val="22"/>
+        </w:rPr>
+        <w:t>：金融、能源、贸易、航运和科技传播。</w:t>
+      </w:r>
+    </w:p>
+    <w:p>
+      <w:pPr>
+        <w:spacing w:after="120" w:line="264" w:lineRule="auto"/>
+      </w:pPr>
+      <w:r>
+        <w:rPr>
+          <w:rFonts w:ascii="PingFang SC" w:hAnsi="PingFang SC" w:eastAsia="PingFang SC"/>
+          <w:b w:val="0"/>
+          <w:color w:val="1F2937"/>
+          <w:sz w:val="22"/>
+        </w:rPr>
+        <w:t>首页仍然只选择三件，不要求四类平均出现。事件必须先按现实影响、变化强度、可验证性和持续观察价值入选，不能因为容易套用某种古典解释而获得更高排序。</w:t>
+      </w:r>
+    </w:p>
+    <w:p>
+      <w:pPr>
         <w:pStyle w:val="Heading3"/>
       </w:pPr>
       <w:r>
@@ -1452,7 +1588,7 @@
       <w:pPr>
         <w:numPr>
           <w:ilvl w:val="0"/>
-          <w:numId w:val="13"/>
+          <w:numId w:val="14"/>
         </w:numPr>
         <w:spacing w:after="160" w:line="280" w:lineRule="auto"/>
       </w:pPr>
@@ -1470,7 +1606,7 @@
       <w:pPr>
         <w:numPr>
           <w:ilvl w:val="0"/>
-          <w:numId w:val="13"/>
+          <w:numId w:val="14"/>
         </w:numPr>
         <w:spacing w:after="160" w:line="280" w:lineRule="auto"/>
       </w:pPr>
@@ -1488,7 +1624,7 @@
       <w:pPr>
         <w:numPr>
           <w:ilvl w:val="0"/>
-          <w:numId w:val="13"/>
+          <w:numId w:val="14"/>
         </w:numPr>
         <w:spacing w:after="160" w:line="280" w:lineRule="auto"/>
       </w:pPr>
@@ -1506,7 +1642,7 @@
       <w:pPr>
         <w:numPr>
           <w:ilvl w:val="0"/>
-          <w:numId w:val="13"/>
+          <w:numId w:val="14"/>
         </w:numPr>
         <w:spacing w:after="160" w:line="280" w:lineRule="auto"/>
       </w:pPr>
@@ -1524,7 +1660,7 @@
       <w:pPr>
         <w:numPr>
           <w:ilvl w:val="0"/>
-          <w:numId w:val="13"/>
+          <w:numId w:val="14"/>
         </w:numPr>
         <w:spacing w:after="160" w:line="280" w:lineRule="auto"/>
       </w:pPr>
@@ -1542,7 +1678,7 @@
       <w:pPr>
         <w:numPr>
           <w:ilvl w:val="0"/>
-          <w:numId w:val="13"/>
+          <w:numId w:val="14"/>
         </w:numPr>
         <w:spacing w:after="160" w:line="280" w:lineRule="auto"/>
       </w:pPr>
@@ -1616,7 +1752,7 @@
       <w:pPr>
         <w:numPr>
           <w:ilvl w:val="0"/>
-          <w:numId w:val="14"/>
+          <w:numId w:val="15"/>
         </w:numPr>
         <w:spacing w:after="160" w:line="280" w:lineRule="auto"/>
       </w:pPr>
@@ -1643,7 +1779,7 @@
       <w:pPr>
         <w:numPr>
           <w:ilvl w:val="0"/>
-          <w:numId w:val="14"/>
+          <w:numId w:val="15"/>
         </w:numPr>
         <w:spacing w:after="160" w:line="280" w:lineRule="auto"/>
       </w:pPr>
@@ -1670,7 +1806,7 @@
       <w:pPr>
         <w:numPr>
           <w:ilvl w:val="0"/>
-          <w:numId w:val="14"/>
+          <w:numId w:val="15"/>
         </w:numPr>
         <w:spacing w:after="160" w:line="280" w:lineRule="auto"/>
       </w:pPr>
@@ -1697,7 +1833,7 @@
       <w:pPr>
         <w:numPr>
           <w:ilvl w:val="0"/>
-          <w:numId w:val="14"/>
+          <w:numId w:val="15"/>
         </w:numPr>
         <w:spacing w:after="160" w:line="280" w:lineRule="auto"/>
       </w:pPr>
@@ -1724,7 +1860,7 @@
       <w:pPr>
         <w:numPr>
           <w:ilvl w:val="0"/>
-          <w:numId w:val="14"/>
+          <w:numId w:val="15"/>
         </w:numPr>
         <w:spacing w:after="160" w:line="280" w:lineRule="auto"/>
       </w:pPr>
@@ -1891,7 +2027,7 @@
       <w:pPr>
         <w:numPr>
           <w:ilvl w:val="0"/>
-          <w:numId w:val="15"/>
+          <w:numId w:val="16"/>
         </w:numPr>
         <w:spacing w:after="160" w:line="280" w:lineRule="auto"/>
       </w:pPr>
@@ -1909,7 +2045,7 @@
       <w:pPr>
         <w:numPr>
           <w:ilvl w:val="0"/>
-          <w:numId w:val="15"/>
+          <w:numId w:val="16"/>
         </w:numPr>
         <w:spacing w:after="160" w:line="280" w:lineRule="auto"/>
       </w:pPr>
@@ -1927,7 +2063,7 @@
       <w:pPr>
         <w:numPr>
           <w:ilvl w:val="0"/>
-          <w:numId w:val="15"/>
+          <w:numId w:val="16"/>
         </w:numPr>
         <w:spacing w:after="160" w:line="280" w:lineRule="auto"/>
       </w:pPr>
@@ -1945,7 +2081,7 @@
       <w:pPr>
         <w:numPr>
           <w:ilvl w:val="0"/>
-          <w:numId w:val="15"/>
+          <w:numId w:val="16"/>
         </w:numPr>
         <w:spacing w:after="160" w:line="280" w:lineRule="auto"/>
       </w:pPr>
@@ -1963,7 +2099,7 @@
       <w:pPr>
         <w:numPr>
           <w:ilvl w:val="0"/>
-          <w:numId w:val="15"/>
+          <w:numId w:val="16"/>
         </w:numPr>
         <w:spacing w:after="160" w:line="280" w:lineRule="auto"/>
       </w:pPr>
@@ -2898,7 +3034,7 @@
       <w:pPr>
         <w:numPr>
           <w:ilvl w:val="0"/>
-          <w:numId w:val="16"/>
+          <w:numId w:val="17"/>
         </w:numPr>
         <w:spacing w:after="160" w:line="280" w:lineRule="auto"/>
       </w:pPr>
@@ -2925,7 +3061,7 @@
       <w:pPr>
         <w:numPr>
           <w:ilvl w:val="0"/>
-          <w:numId w:val="16"/>
+          <w:numId w:val="17"/>
         </w:numPr>
         <w:spacing w:after="160" w:line="280" w:lineRule="auto"/>
       </w:pPr>
@@ -2952,7 +3088,7 @@
       <w:pPr>
         <w:numPr>
           <w:ilvl w:val="0"/>
-          <w:numId w:val="16"/>
+          <w:numId w:val="17"/>
         </w:numPr>
         <w:spacing w:after="160" w:line="280" w:lineRule="auto"/>
       </w:pPr>
@@ -3049,7 +3185,7 @@
       <w:pPr>
         <w:numPr>
           <w:ilvl w:val="0"/>
-          <w:numId w:val="17"/>
+          <w:numId w:val="18"/>
         </w:numPr>
         <w:spacing w:after="160" w:line="280" w:lineRule="auto"/>
       </w:pPr>
@@ -3067,7 +3203,7 @@
       <w:pPr>
         <w:numPr>
           <w:ilvl w:val="0"/>
-          <w:numId w:val="17"/>
+          <w:numId w:val="18"/>
         </w:numPr>
         <w:spacing w:after="160" w:line="280" w:lineRule="auto"/>
       </w:pPr>
@@ -3085,7 +3221,7 @@
       <w:pPr>
         <w:numPr>
           <w:ilvl w:val="0"/>
-          <w:numId w:val="17"/>
+          <w:numId w:val="18"/>
         </w:numPr>
         <w:spacing w:after="160" w:line="280" w:lineRule="auto"/>
       </w:pPr>
@@ -3103,7 +3239,7 @@
       <w:pPr>
         <w:numPr>
           <w:ilvl w:val="0"/>
-          <w:numId w:val="17"/>
+          <w:numId w:val="18"/>
         </w:numPr>
         <w:spacing w:after="160" w:line="280" w:lineRule="auto"/>
       </w:pPr>
@@ -3121,7 +3257,7 @@
       <w:pPr>
         <w:numPr>
           <w:ilvl w:val="0"/>
-          <w:numId w:val="17"/>
+          <w:numId w:val="18"/>
         </w:numPr>
         <w:spacing w:after="160" w:line="280" w:lineRule="auto"/>
       </w:pPr>
@@ -3181,7 +3317,7 @@
       <w:pPr>
         <w:numPr>
           <w:ilvl w:val="0"/>
-          <w:numId w:val="18"/>
+          <w:numId w:val="19"/>
         </w:numPr>
         <w:spacing w:after="160" w:line="280" w:lineRule="auto"/>
       </w:pPr>
@@ -3199,7 +3335,7 @@
       <w:pPr>
         <w:numPr>
           <w:ilvl w:val="0"/>
-          <w:numId w:val="18"/>
+          <w:numId w:val="19"/>
         </w:numPr>
         <w:spacing w:after="160" w:line="280" w:lineRule="auto"/>
       </w:pPr>
@@ -3217,7 +3353,7 @@
       <w:pPr>
         <w:numPr>
           <w:ilvl w:val="0"/>
-          <w:numId w:val="18"/>
+          <w:numId w:val="19"/>
         </w:numPr>
         <w:spacing w:after="160" w:line="280" w:lineRule="auto"/>
       </w:pPr>
@@ -3235,7 +3371,7 @@
       <w:pPr>
         <w:numPr>
           <w:ilvl w:val="0"/>
-          <w:numId w:val="18"/>
+          <w:numId w:val="19"/>
         </w:numPr>
         <w:spacing w:after="160" w:line="280" w:lineRule="auto"/>
       </w:pPr>
@@ -3267,7 +3403,7 @@
       <w:pPr>
         <w:numPr>
           <w:ilvl w:val="0"/>
-          <w:numId w:val="19"/>
+          <w:numId w:val="20"/>
         </w:numPr>
         <w:spacing w:after="160" w:line="280" w:lineRule="auto"/>
       </w:pPr>
@@ -3285,7 +3421,7 @@
       <w:pPr>
         <w:numPr>
           <w:ilvl w:val="0"/>
-          <w:numId w:val="19"/>
+          <w:numId w:val="20"/>
         </w:numPr>
         <w:spacing w:after="160" w:line="280" w:lineRule="auto"/>
       </w:pPr>
@@ -3303,7 +3439,7 @@
       <w:pPr>
         <w:numPr>
           <w:ilvl w:val="0"/>
-          <w:numId w:val="19"/>
+          <w:numId w:val="20"/>
         </w:numPr>
         <w:spacing w:after="160" w:line="280" w:lineRule="auto"/>
       </w:pPr>
@@ -3321,7 +3457,7 @@
       <w:pPr>
         <w:numPr>
           <w:ilvl w:val="0"/>
-          <w:numId w:val="19"/>
+          <w:numId w:val="20"/>
         </w:numPr>
         <w:spacing w:after="160" w:line="280" w:lineRule="auto"/>
       </w:pPr>
@@ -3339,7 +3475,7 @@
       <w:pPr>
         <w:numPr>
           <w:ilvl w:val="0"/>
-          <w:numId w:val="19"/>
+          <w:numId w:val="20"/>
         </w:numPr>
         <w:spacing w:after="160" w:line="280" w:lineRule="auto"/>
       </w:pPr>
@@ -3399,7 +3535,7 @@
       <w:pPr>
         <w:numPr>
           <w:ilvl w:val="0"/>
-          <w:numId w:val="20"/>
+          <w:numId w:val="21"/>
         </w:numPr>
         <w:spacing w:after="160" w:line="280" w:lineRule="auto"/>
       </w:pPr>
@@ -3426,7 +3562,7 @@
       <w:pPr>
         <w:numPr>
           <w:ilvl w:val="0"/>
-          <w:numId w:val="20"/>
+          <w:numId w:val="21"/>
         </w:numPr>
         <w:spacing w:after="160" w:line="280" w:lineRule="auto"/>
       </w:pPr>
@@ -3453,7 +3589,7 @@
       <w:pPr>
         <w:numPr>
           <w:ilvl w:val="0"/>
-          <w:numId w:val="20"/>
+          <w:numId w:val="21"/>
         </w:numPr>
         <w:spacing w:after="160" w:line="280" w:lineRule="auto"/>
       </w:pPr>
@@ -3480,7 +3616,7 @@
       <w:pPr>
         <w:numPr>
           <w:ilvl w:val="0"/>
-          <w:numId w:val="20"/>
+          <w:numId w:val="21"/>
         </w:numPr>
         <w:spacing w:after="160" w:line="280" w:lineRule="auto"/>
       </w:pPr>
@@ -3507,7 +3643,7 @@
       <w:pPr>
         <w:numPr>
           <w:ilvl w:val="0"/>
-          <w:numId w:val="20"/>
+          <w:numId w:val="21"/>
         </w:numPr>
         <w:spacing w:after="160" w:line="280" w:lineRule="auto"/>
       </w:pPr>
@@ -3623,7 +3759,7 @@
       <w:pPr>
         <w:numPr>
           <w:ilvl w:val="0"/>
-          <w:numId w:val="21"/>
+          <w:numId w:val="22"/>
         </w:numPr>
         <w:spacing w:after="160" w:line="280" w:lineRule="auto"/>
       </w:pPr>
@@ -3641,7 +3777,7 @@
       <w:pPr>
         <w:numPr>
           <w:ilvl w:val="0"/>
-          <w:numId w:val="21"/>
+          <w:numId w:val="22"/>
         </w:numPr>
         <w:spacing w:after="160" w:line="280" w:lineRule="auto"/>
       </w:pPr>
@@ -3659,7 +3795,7 @@
       <w:pPr>
         <w:numPr>
           <w:ilvl w:val="0"/>
-          <w:numId w:val="21"/>
+          <w:numId w:val="22"/>
         </w:numPr>
         <w:spacing w:after="160" w:line="280" w:lineRule="auto"/>
       </w:pPr>
@@ -3677,7 +3813,7 @@
       <w:pPr>
         <w:numPr>
           <w:ilvl w:val="0"/>
-          <w:numId w:val="21"/>
+          <w:numId w:val="22"/>
         </w:numPr>
         <w:spacing w:after="160" w:line="280" w:lineRule="auto"/>
       </w:pPr>
@@ -3695,7 +3831,7 @@
       <w:pPr>
         <w:numPr>
           <w:ilvl w:val="0"/>
-          <w:numId w:val="21"/>
+          <w:numId w:val="22"/>
         </w:numPr>
         <w:spacing w:after="160" w:line="280" w:lineRule="auto"/>
       </w:pPr>
@@ -3713,7 +3849,7 @@
       <w:pPr>
         <w:numPr>
           <w:ilvl w:val="0"/>
-          <w:numId w:val="21"/>
+          <w:numId w:val="22"/>
         </w:numPr>
         <w:spacing w:after="160" w:line="280" w:lineRule="auto"/>
       </w:pPr>
@@ -3731,7 +3867,7 @@
       <w:pPr>
         <w:numPr>
           <w:ilvl w:val="0"/>
-          <w:numId w:val="21"/>
+          <w:numId w:val="22"/>
         </w:numPr>
         <w:spacing w:after="160" w:line="280" w:lineRule="auto"/>
       </w:pPr>
@@ -3749,7 +3885,7 @@
       <w:pPr>
         <w:numPr>
           <w:ilvl w:val="0"/>
-          <w:numId w:val="21"/>
+          <w:numId w:val="22"/>
         </w:numPr>
         <w:spacing w:after="160" w:line="280" w:lineRule="auto"/>
       </w:pPr>
@@ -3781,7 +3917,7 @@
       <w:pPr>
         <w:numPr>
           <w:ilvl w:val="0"/>
-          <w:numId w:val="22"/>
+          <w:numId w:val="23"/>
         </w:numPr>
         <w:spacing w:after="160" w:line="280" w:lineRule="auto"/>
       </w:pPr>
@@ -3799,7 +3935,7 @@
       <w:pPr>
         <w:numPr>
           <w:ilvl w:val="0"/>
-          <w:numId w:val="22"/>
+          <w:numId w:val="23"/>
         </w:numPr>
         <w:spacing w:after="160" w:line="280" w:lineRule="auto"/>
       </w:pPr>
@@ -3817,7 +3953,7 @@
       <w:pPr>
         <w:numPr>
           <w:ilvl w:val="0"/>
-          <w:numId w:val="22"/>
+          <w:numId w:val="23"/>
         </w:numPr>
         <w:spacing w:after="160" w:line="280" w:lineRule="auto"/>
       </w:pPr>
@@ -3835,7 +3971,7 @@
       <w:pPr>
         <w:numPr>
           <w:ilvl w:val="0"/>
-          <w:numId w:val="22"/>
+          <w:numId w:val="23"/>
         </w:numPr>
         <w:spacing w:after="160" w:line="280" w:lineRule="auto"/>
       </w:pPr>
@@ -3853,7 +3989,7 @@
       <w:pPr>
         <w:numPr>
           <w:ilvl w:val="0"/>
-          <w:numId w:val="22"/>
+          <w:numId w:val="23"/>
         </w:numPr>
         <w:spacing w:after="160" w:line="280" w:lineRule="auto"/>
       </w:pPr>
@@ -3871,7 +4007,7 @@
       <w:pPr>
         <w:numPr>
           <w:ilvl w:val="0"/>
-          <w:numId w:val="22"/>
+          <w:numId w:val="23"/>
         </w:numPr>
         <w:spacing w:after="160" w:line="280" w:lineRule="auto"/>
       </w:pPr>
@@ -3889,7 +4025,25 @@
       <w:pPr>
         <w:numPr>
           <w:ilvl w:val="0"/>
-          <w:numId w:val="22"/>
+          <w:numId w:val="23"/>
+        </w:numPr>
+        <w:spacing w:after="160" w:line="280" w:lineRule="auto"/>
+      </w:pPr>
+      <w:r>
+        <w:rPr>
+          <w:rFonts w:ascii="PingFang SC" w:hAnsi="PingFang SC" w:eastAsia="PingFang SC"/>
+          <w:b w:val="0"/>
+          <w:color w:val="1F2937"/>
+          <w:sz w:val="22"/>
+        </w:rPr>
+        <w:t>疫病诊断、治疗、用药或基于天象的疫情预测；</w:t>
+      </w:r>
+    </w:p>
+    <w:p>
+      <w:pPr>
+        <w:numPr>
+          <w:ilvl w:val="0"/>
+          <w:numId w:val="23"/>
         </w:numPr>
         <w:spacing w:after="160" w:line="280" w:lineRule="auto"/>
       </w:pPr>
@@ -4131,7 +4285,7 @@
       <w:pPr>
         <w:numPr>
           <w:ilvl w:val="0"/>
-          <w:numId w:val="23"/>
+          <w:numId w:val="24"/>
         </w:numPr>
         <w:spacing w:after="160" w:line="280" w:lineRule="auto"/>
       </w:pPr>
@@ -4149,7 +4303,7 @@
       <w:pPr>
         <w:numPr>
           <w:ilvl w:val="0"/>
-          <w:numId w:val="23"/>
+          <w:numId w:val="24"/>
         </w:numPr>
         <w:spacing w:after="160" w:line="280" w:lineRule="auto"/>
       </w:pPr>
@@ -4167,7 +4321,7 @@
       <w:pPr>
         <w:numPr>
           <w:ilvl w:val="0"/>
-          <w:numId w:val="23"/>
+          <w:numId w:val="24"/>
         </w:numPr>
         <w:spacing w:after="160" w:line="280" w:lineRule="auto"/>
       </w:pPr>
@@ -4185,7 +4339,7 @@
       <w:pPr>
         <w:numPr>
           <w:ilvl w:val="0"/>
-          <w:numId w:val="23"/>
+          <w:numId w:val="24"/>
         </w:numPr>
         <w:spacing w:after="160" w:line="280" w:lineRule="auto"/>
       </w:pPr>
@@ -4203,7 +4357,7 @@
       <w:pPr>
         <w:numPr>
           <w:ilvl w:val="0"/>
-          <w:numId w:val="23"/>
+          <w:numId w:val="24"/>
         </w:numPr>
         <w:spacing w:after="160" w:line="280" w:lineRule="auto"/>
       </w:pPr>
@@ -4221,7 +4375,7 @@
       <w:pPr>
         <w:numPr>
           <w:ilvl w:val="0"/>
-          <w:numId w:val="23"/>
+          <w:numId w:val="24"/>
         </w:numPr>
         <w:spacing w:after="160" w:line="280" w:lineRule="auto"/>
       </w:pPr>
@@ -4239,7 +4393,7 @@
       <w:pPr>
         <w:numPr>
           <w:ilvl w:val="0"/>
-          <w:numId w:val="23"/>
+          <w:numId w:val="24"/>
         </w:numPr>
         <w:spacing w:after="160" w:line="280" w:lineRule="auto"/>
       </w:pPr>
@@ -4257,7 +4411,7 @@
       <w:pPr>
         <w:numPr>
           <w:ilvl w:val="0"/>
-          <w:numId w:val="23"/>
+          <w:numId w:val="24"/>
         </w:numPr>
         <w:spacing w:after="160" w:line="280" w:lineRule="auto"/>
       </w:pPr>
@@ -4275,7 +4429,7 @@
       <w:pPr>
         <w:numPr>
           <w:ilvl w:val="0"/>
-          <w:numId w:val="23"/>
+          <w:numId w:val="24"/>
         </w:numPr>
         <w:spacing w:after="160" w:line="280" w:lineRule="auto"/>
       </w:pPr>
@@ -4293,7 +4447,7 @@
       <w:pPr>
         <w:numPr>
           <w:ilvl w:val="0"/>
-          <w:numId w:val="23"/>
+          <w:numId w:val="24"/>
         </w:numPr>
         <w:spacing w:after="160" w:line="280" w:lineRule="auto"/>
       </w:pPr>
@@ -4311,7 +4465,7 @@
       <w:pPr>
         <w:numPr>
           <w:ilvl w:val="0"/>
-          <w:numId w:val="23"/>
+          <w:numId w:val="24"/>
         </w:numPr>
         <w:spacing w:after="160" w:line="280" w:lineRule="auto"/>
       </w:pPr>
@@ -4329,7 +4483,7 @@
       <w:pPr>
         <w:numPr>
           <w:ilvl w:val="0"/>
-          <w:numId w:val="23"/>
+          <w:numId w:val="24"/>
         </w:numPr>
         <w:spacing w:after="160" w:line="280" w:lineRule="auto"/>
       </w:pPr>
@@ -4347,7 +4501,7 @@
       <w:pPr>
         <w:numPr>
           <w:ilvl w:val="0"/>
-          <w:numId w:val="23"/>
+          <w:numId w:val="24"/>
         </w:numPr>
         <w:spacing w:after="160" w:line="280" w:lineRule="auto"/>
       </w:pPr>
@@ -4365,7 +4519,7 @@
       <w:pPr>
         <w:numPr>
           <w:ilvl w:val="0"/>
-          <w:numId w:val="23"/>
+          <w:numId w:val="24"/>
         </w:numPr>
         <w:spacing w:after="160" w:line="280" w:lineRule="auto"/>
       </w:pPr>
@@ -4768,7 +4922,7 @@
     </w:lvlOverride>
   </w:num>
   <w:num w:numId="13">
-    <w:abstractNumId w:val="10"/>
+    <w:abstractNumId w:val="9"/>
     <w:lvlOverride w:ilvl="0">
       <w:startOverride w:val="1"/>
     </w:lvlOverride>
@@ -4780,19 +4934,19 @@
     </w:lvlOverride>
   </w:num>
   <w:num w:numId="15">
+    <w:abstractNumId w:val="10"/>
+    <w:lvlOverride w:ilvl="0">
+      <w:startOverride w:val="1"/>
+    </w:lvlOverride>
+  </w:num>
+  <w:num w:numId="16">
     <w:abstractNumId w:val="9"/>
     <w:lvlOverride w:ilvl="0">
       <w:startOverride w:val="1"/>
     </w:lvlOverride>
   </w:num>
-  <w:num w:numId="16">
+  <w:num w:numId="17">
     <w:abstractNumId w:val="10"/>
-    <w:lvlOverride w:ilvl="0">
-      <w:startOverride w:val="1"/>
-    </w:lvlOverride>
-  </w:num>
-  <w:num w:numId="17">
-    <w:abstractNumId w:val="9"/>
     <w:lvlOverride w:ilvl="0">
       <w:startOverride w:val="1"/>
     </w:lvlOverride>
@@ -4816,18 +4970,24 @@
     </w:lvlOverride>
   </w:num>
   <w:num w:numId="21">
+    <w:abstractNumId w:val="9"/>
+    <w:lvlOverride w:ilvl="0">
+      <w:startOverride w:val="1"/>
+    </w:lvlOverride>
+  </w:num>
+  <w:num w:numId="22">
     <w:abstractNumId w:val="10"/>
     <w:lvlOverride w:ilvl="0">
       <w:startOverride w:val="1"/>
     </w:lvlOverride>
   </w:num>
-  <w:num w:numId="22">
+  <w:num w:numId="23">
     <w:abstractNumId w:val="9"/>
     <w:lvlOverride w:ilvl="0">
       <w:startOverride w:val="1"/>
     </w:lvlOverride>
   </w:num>
-  <w:num w:numId="23">
+  <w:num w:numId="24">
     <w:abstractNumId w:val="10"/>
     <w:lvlOverride w:ilvl="0">
       <w:startOverride w:val="1"/>

</xml_diff>